<commit_message>
Update Var2 results and report
</commit_message>
<xml_diff>
--- a/report1.docx
+++ b/report1.docx
@@ -4,15 +4,24 @@
   <w:body>
     <w:p>
       <w:pPr>
-        <w:rPr>
-          <w:noProof/>
-        </w:rPr>
-      </w:pPr>
-      <w:r>
-        <w:rPr>
-          <w:noProof/>
-        </w:rPr>
-        <w:t xml:space="preserve">Github: </w:t>
+        <w:jc w:val="center"/>
+        <w:rPr>
+          <w:b/>
+          <w:bCs/>
+          <w:noProof/>
+          <w:sz w:val="44"/>
+          <w:szCs w:val="44"/>
+        </w:rPr>
+      </w:pPr>
+      <w:r>
+        <w:rPr>
+          <w:b/>
+          <w:bCs/>
+          <w:noProof/>
+          <w:sz w:val="44"/>
+          <w:szCs w:val="44"/>
+        </w:rPr>
+        <w:t>Report</w:t>
       </w:r>
     </w:p>
     <w:p>
@@ -139,7 +148,19 @@
         <w:rPr>
           <w:noProof/>
         </w:rPr>
-        <w:t xml:space="preserve"> find the most approprite degree of the polynomial that is to be used </w:t>
+        <w:t xml:space="preserve"> find the most </w:t>
+      </w:r>
+      <w:r>
+        <w:rPr>
+          <w:noProof/>
+        </w:rPr>
+        <w:t>approprite</w:t>
+      </w:r>
+      <w:r>
+        <w:rPr>
+          <w:noProof/>
+        </w:rPr>
+        <w:t xml:space="preserve"> degree of the polynomial that is to be used </w:t>
       </w:r>
       <w:r>
         <w:rPr>
@@ -451,7 +472,7 @@
           <w:noProof/>
         </w:rPr>
         <w:br/>
-        <w:t xml:space="preserve">5 folds cross validation was choosen for the sake of simplicity, and that way 800 </w:t>
+        <w:t xml:space="preserve">5 folds cross validation was chosen for the sake of simplicity, and that way 800 </w:t>
       </w:r>
       <w:r>
         <w:rPr>
@@ -887,7 +908,13 @@
         <w:rPr>
           <w:noProof/>
         </w:rPr>
-        <w:t xml:space="preserve"> was also calcultated</w:t>
+        <w:t xml:space="preserve"> was also </w:t>
+      </w:r>
+      <w:r>
+        <w:rPr>
+          <w:noProof/>
+        </w:rPr>
+        <w:t>calculated</w:t>
       </w:r>
       <w:r>
         <w:rPr>
@@ -1069,7 +1096,7 @@
         <w:rPr>
           <w:noProof/>
         </w:rPr>
-        <w:t>s</w:t>
+        <w:t>S</w:t>
       </w:r>
       <w:r>
         <w:rPr>
@@ -1454,6 +1481,60 @@
           <w:noProof/>
         </w:rPr>
       </w:pPr>
+      <w:r>
+        <w:rPr>
+          <w:noProof/>
+        </w:rPr>
+        <w:lastRenderedPageBreak/>
+        <w:drawing>
+          <wp:inline distT="0" distB="0" distL="0" distR="0" wp14:anchorId="29707AB6" wp14:editId="0F35D9CD">
+            <wp:extent cx="4783540" cy="2928385"/>
+            <wp:effectExtent l="0" t="0" r="0" b="5715"/>
+            <wp:docPr id="858068939" name="Picture 16"/>
+            <wp:cNvGraphicFramePr>
+              <a:graphicFrameLocks xmlns:a="http://schemas.openxmlformats.org/drawingml/2006/main" noChangeAspect="1"/>
+            </wp:cNvGraphicFramePr>
+            <a:graphic xmlns:a="http://schemas.openxmlformats.org/drawingml/2006/main">
+              <a:graphicData uri="http://schemas.openxmlformats.org/drawingml/2006/picture">
+                <pic:pic xmlns:pic="http://schemas.openxmlformats.org/drawingml/2006/picture">
+                  <pic:nvPicPr>
+                    <pic:cNvPr id="0" name="Picture 49"/>
+                    <pic:cNvPicPr>
+                      <a:picLocks noChangeAspect="1" noChangeArrowheads="1"/>
+                    </pic:cNvPicPr>
+                  </pic:nvPicPr>
+                  <pic:blipFill>
+                    <a:blip r:embed="rId9" cstate="print">
+                      <a:extLst>
+                        <a:ext uri="{28A0092B-C50C-407E-A947-70E740481C1C}">
+                          <a14:useLocalDpi xmlns:a14="http://schemas.microsoft.com/office/drawing/2010/main" val="0"/>
+                        </a:ext>
+                      </a:extLst>
+                    </a:blip>
+                    <a:srcRect/>
+                    <a:stretch>
+                      <a:fillRect/>
+                    </a:stretch>
+                  </pic:blipFill>
+                  <pic:spPr bwMode="auto">
+                    <a:xfrm>
+                      <a:off x="0" y="0"/>
+                      <a:ext cx="4810067" cy="2944624"/>
+                    </a:xfrm>
+                    <a:prstGeom prst="rect">
+                      <a:avLst/>
+                    </a:prstGeom>
+                    <a:noFill/>
+                    <a:ln>
+                      <a:noFill/>
+                    </a:ln>
+                  </pic:spPr>
+                </pic:pic>
+              </a:graphicData>
+            </a:graphic>
+          </wp:inline>
+        </w:drawing>
+      </w:r>
     </w:p>
     <w:p>
       <w:pPr>
@@ -1473,13 +1554,38 @@
     </w:p>
     <w:p>
       <w:pPr>
-        <w:rPr>
-          <w:noProof/>
-        </w:rPr>
-      </w:pPr>
-    </w:p>
-    <w:p/>
-    <w:p/>
+        <w:jc w:val="center"/>
+        <w:rPr>
+          <w:noProof/>
+        </w:rPr>
+      </w:pPr>
+    </w:p>
+    <w:p>
+      <w:pPr>
+        <w:rPr>
+          <w:noProof/>
+        </w:rPr>
+      </w:pPr>
+      <w:r>
+        <w:rPr>
+          <w:noProof/>
+        </w:rPr>
+        <w:t xml:space="preserve">Github: </w:t>
+      </w:r>
+      <w:r>
+        <w:rPr>
+          <w:noProof/>
+        </w:rPr>
+        <w:t>https://github.com/abh1gjna/ML_Assignment_1</w:t>
+      </w:r>
+    </w:p>
+    <w:p>
+      <w:pPr>
+        <w:rPr>
+          <w:noProof/>
+        </w:rPr>
+      </w:pPr>
+    </w:p>
     <w:sectPr>
       <w:pgSz w:w="12240" w:h="15840"/>
       <w:pgMar w:top="1440" w:right="1440" w:bottom="1440" w:left="1440" w:header="720" w:footer="720" w:gutter="0"/>

</xml_diff>